<commit_message>
Facebook-Gruppe und Instagram im Kontakt-Bereich von Buch und Journal ergänzen
</commit_message>
<xml_diff>
--- a/outputs/buch-schuldgefuehle/das-schlechte-gewissen-Journal.docx
+++ b/outputs/buch-schuldgefuehle/das-schlechte-gewissen-Journal.docx
@@ -5357,6 +5357,32 @@
           <w:szCs w:val="24"/>
         </w:rPr>
         <w:t xml:space="preserve">info.safetothrive@gmail.com</w:t>
+      </w:r>
+    </w:p>
+    <w:p>
+      <w:pPr>
+        <w:spacing w:after="200"/>
+      </w:pPr>
+      <w:r>
+        <w:rPr>
+          <w:rFonts w:ascii="Calibri" w:cs="Calibri" w:eastAsia="Calibri" w:hAnsi="Calibri"/>
+          <w:sz w:val="24"/>
+          <w:szCs w:val="24"/>
+        </w:rPr>
+        <w:t xml:space="preserve">Facebook-Gruppe: Safe to Thrive — Dein Leben. Deine Regeln</w:t>
+      </w:r>
+    </w:p>
+    <w:p>
+      <w:pPr>
+        <w:spacing w:after="200"/>
+      </w:pPr>
+      <w:r>
+        <w:rPr>
+          <w:rFonts w:ascii="Calibri" w:cs="Calibri" w:eastAsia="Calibri" w:hAnsi="Calibri"/>
+          <w:sz w:val="24"/>
+          <w:szCs w:val="24"/>
+        </w:rPr>
+        <w:t xml:space="preserve">Instagram: @petratanner.autorin</w:t>
       </w:r>
     </w:p>
     <w:p>

</xml_diff>